<commit_message>
chore: add demo screenshots, ignore .superpowers/, update demo script and UI fixes
- Add 5 demo flow screenshots (dashboard, Jarrett, new sim, launch)
- Add .superpowers/ to .gitignore (local tool artifact like .claude/)
- Update demo-script.docx
- Jarrett widget and sounding client UI updates

Co-Authored-By: Claude Sonnet 4.6 <noreply@anthropic.com>
</commit_message>
<xml_diff>
--- a/docs/demo-script.docx
+++ b/docs/demo-script.docx
@@ -491,7 +491,7 @@
           <w:sz w:val="24"/>
           <w:shd w:fill="E8F5E9" w:val="clear"/>
         </w:rPr>
-        <w:t xml:space="preserve">US core PCE re-accelerates to 3.2% </w:t>
+        <w:t xml:space="preserve">Fed revises neutral rate upward citing AI productivity </w:t>
       </w:r>
       <w:r>
         <w:rPr>
@@ -502,7 +502,7 @@
           <w:sz w:val="24"/>
           <w:shd w:fill="E8F5E9" w:val="clear"/>
         </w:rPr>
-        <w:t xml:space="preserve">— inflation progress stalls</w:t>
+        <w:t xml:space="preserve">— r raised to 3.5%</w:t>
       </w:r>
     </w:p>
     <w:p>

</xml_diff>